<commit_message>
Documentation des elements bonus (MLflow, cloud, dashboard) dans le README et le rapport
</commit_message>
<xml_diff>
--- a/reports/rapport.docx
+++ b/reports/rapport.docx
@@ -1748,6 +1748,281 @@
           <w:szCs w:val="22"/>
         </w:rPr>
         <w:t xml:space="preserve">Plusieurs pistes pourraient améliorer ce travail. Du côté de la représentation du texte, essayer des embeddings plus avancés (Sentence Transformers ou BERT) pourrait mieux capturer le sens des tweets que le TF-IDF. Du côté du déséquilibre des classes, comparer le SMOTE ou l'undersampling avec le class weight utilisé ici permettrait de voir si d'autres stratégies fonctionnent mieux. Enfin, vu la limite observée sur des phrases inhabituelles, il serait intéressant de tester le modèle sur un autre jeu de tweets, différent de celui utilisé pour l'entraînement, pour mieux évaluer sa capacité à généraliser.</w:t>
+      </w:r>
+    </w:p>
+    <w:p>
+      <w:pPr>
+        <w:pStyle w:val="Heading1"/>
+      </w:pPr>
+      <w:r>
+        <w:t xml:space="preserve">V. Éléments bonus</w:t>
+      </w:r>
+    </w:p>
+    <w:p>
+      <w:pPr>
+        <w:spacing w:after="200"/>
+      </w:pPr>
+      <w:r>
+        <w:rPr>
+          <w:sz w:val="22"/>
+          <w:szCs w:val="22"/>
+        </w:rPr>
+        <w:t xml:space="preserve">En plus des parties demandées dans le sujet, trois éléments supplémentaires ont été ajoutés au projet.</w:t>
+      </w:r>
+    </w:p>
+    <w:p>
+      <w:pPr>
+        <w:pStyle w:val="Heading2"/>
+      </w:pPr>
+      <w:r>
+        <w:t xml:space="preserve">A. Suivi des expériences avec MLflow</w:t>
+      </w:r>
+    </w:p>
+    <w:p>
+      <w:pPr>
+        <w:spacing w:after="200"/>
+      </w:pPr>
+      <w:r>
+        <w:rPr>
+          <w:sz w:val="22"/>
+          <w:szCs w:val="22"/>
+        </w:rPr>
+        <w:t xml:space="preserve">En complément du suivi déjà fait avec DVC, les scripts train.py et evaluate.py enregistrent aussi les paramètres et métriques de chaque exécution avec MLflow (mlflow.log_params, mlflow.log_metrics). Cela permet de comparer facilement les différentes exécutions du pipeline depuis l'interface MLflow.</w:t>
+      </w:r>
+    </w:p>
+    <w:p>
+      <w:pPr>
+        <w:spacing w:after="80" w:before="200"/>
+        <w:jc w:val="center"/>
+      </w:pPr>
+      <w:r>
+        <w:drawing>
+          <wp:inline distT="0" distB="0" distL="0" distR="0">
+            <wp:extent cx="3333750" cy="2333625"/>
+            <wp:effectExtent t="0" r="0" b="0" l="0"/>
+            <wp:docPr id="1" name="figure" descr="Figure 4 : interface MLflow avec les paramètres et métriques d'une exécution" title="Figure 4 : interface MLflow avec les paramètres et métriques d'une exécution"/>
+            <wp:cNvGraphicFramePr>
+              <a:graphicFrameLocks xmlns:a="http://schemas.openxmlformats.org/drawingml/2006/main" noChangeAspect="1"/>
+            </wp:cNvGraphicFramePr>
+            <a:graphic xmlns:a="http://schemas.openxmlformats.org/drawingml/2006/main">
+              <a:graphicData uri="http://schemas.openxmlformats.org/drawingml/2006/picture">
+                <pic:pic xmlns:pic="http://schemas.openxmlformats.org/drawingml/2006/picture">
+                  <pic:nvPicPr>
+                    <pic:cNvPr id="0" name="" descr=""/>
+                    <pic:cNvPicPr>
+                      <a:picLocks noChangeAspect="1" noChangeArrowheads="1"/>
+                    </pic:cNvPicPr>
+                  </pic:nvPicPr>
+                  <pic:blipFill>
+                    <a:blip r:embed="rId10" cstate="none"/>
+                    <a:srcRect/>
+                    <a:stretch>
+                      <a:fillRect/>
+                    </a:stretch>
+                  </pic:blipFill>
+                  <pic:spPr bwMode="auto">
+                    <a:xfrm>
+                      <a:off x="0" y="0"/>
+                      <a:ext cx="3333750" cy="2333625"/>
+                    </a:xfrm>
+                    <a:prstGeom prst="rect">
+                      <a:avLst/>
+                    </a:prstGeom>
+                  </pic:spPr>
+                </pic:pic>
+              </a:graphicData>
+            </a:graphic>
+          </wp:inline>
+        </w:drawing>
+      </w:r>
+    </w:p>
+    <w:p>
+      <w:pPr>
+        <w:spacing w:after="200"/>
+        <w:jc w:val="center"/>
+      </w:pPr>
+      <w:r>
+        <w:rPr>
+          <w:i/>
+          <w:iCs/>
+          <w:sz w:val="18"/>
+          <w:szCs w:val="18"/>
+        </w:rPr>
+        <w:t xml:space="preserve">Figure 4 : interface MLflow avec les paramètres et métriques d'une exécution</w:t>
+      </w:r>
+    </w:p>
+    <w:p>
+      <w:pPr>
+        <w:pStyle w:val="Heading2"/>
+      </w:pPr>
+      <w:r>
+        <w:t xml:space="preserve">B. Déploiement sur le cloud</w:t>
+      </w:r>
+    </w:p>
+    <w:p>
+      <w:pPr>
+        <w:spacing w:after="200"/>
+      </w:pPr>
+      <w:r>
+        <w:rPr>
+          <w:sz w:val="22"/>
+          <w:szCs w:val="22"/>
+        </w:rPr>
+        <w:t xml:space="preserve">L'application Streamlit n'est pas seulement lancée en local : elle est aussi déployée publiquement sur Streamlit Community Cloud, à l'adresse suivante :</w:t>
+      </w:r>
+    </w:p>
+    <w:p>
+      <w:pPr>
+        <w:spacing w:after="200"/>
+      </w:pPr>
+      <w:r>
+        <w:rPr>
+          <w:sz w:val="22"/>
+          <w:szCs w:val="22"/>
+        </w:rPr>
+        <w:t xml:space="preserve">https://tweet-suspect-detection-r8udgvufgsjw8mwwxwyuoz.streamlit.app/</w:t>
+      </w:r>
+    </w:p>
+    <w:p>
+      <w:pPr>
+        <w:spacing w:after="80" w:before="200"/>
+        <w:jc w:val="center"/>
+      </w:pPr>
+      <w:r>
+        <w:drawing>
+          <wp:inline distT="0" distB="0" distL="0" distR="0">
+            <wp:extent cx="3333750" cy="2333625"/>
+            <wp:effectExtent t="0" r="0" b="0" l="0"/>
+            <wp:docPr id="1" name="figure" descr="Figure 5 : application déployée sur Streamlit Community Cloud" title="Figure 5 : application déployée sur Streamlit Community Cloud"/>
+            <wp:cNvGraphicFramePr>
+              <a:graphicFrameLocks xmlns:a="http://schemas.openxmlformats.org/drawingml/2006/main" noChangeAspect="1"/>
+            </wp:cNvGraphicFramePr>
+            <a:graphic xmlns:a="http://schemas.openxmlformats.org/drawingml/2006/main">
+              <a:graphicData uri="http://schemas.openxmlformats.org/drawingml/2006/picture">
+                <pic:pic xmlns:pic="http://schemas.openxmlformats.org/drawingml/2006/picture">
+                  <pic:nvPicPr>
+                    <pic:cNvPr id="0" name="" descr=""/>
+                    <pic:cNvPicPr>
+                      <a:picLocks noChangeAspect="1" noChangeArrowheads="1"/>
+                    </pic:cNvPicPr>
+                  </pic:nvPicPr>
+                  <pic:blipFill>
+                    <a:blip r:embed="rId11" cstate="none"/>
+                    <a:srcRect/>
+                    <a:stretch>
+                      <a:fillRect/>
+                    </a:stretch>
+                  </pic:blipFill>
+                  <pic:spPr bwMode="auto">
+                    <a:xfrm>
+                      <a:off x="0" y="0"/>
+                      <a:ext cx="3333750" cy="2333625"/>
+                    </a:xfrm>
+                    <a:prstGeom prst="rect">
+                      <a:avLst/>
+                    </a:prstGeom>
+                  </pic:spPr>
+                </pic:pic>
+              </a:graphicData>
+            </a:graphic>
+          </wp:inline>
+        </w:drawing>
+      </w:r>
+    </w:p>
+    <w:p>
+      <w:pPr>
+        <w:spacing w:after="200"/>
+        <w:jc w:val="center"/>
+      </w:pPr>
+      <w:r>
+        <w:rPr>
+          <w:i/>
+          <w:iCs/>
+          <w:sz w:val="18"/>
+          <w:szCs w:val="18"/>
+        </w:rPr>
+        <w:t xml:space="preserve">Figure 5 : application déployée sur Streamlit Community Cloud</w:t>
+      </w:r>
+    </w:p>
+    <w:p>
+      <w:pPr>
+        <w:pStyle w:val="Heading2"/>
+      </w:pPr>
+      <w:r>
+        <w:t xml:space="preserve">C. Tableau de bord de suivi du modèle</w:t>
+      </w:r>
+    </w:p>
+    <w:p>
+      <w:pPr>
+        <w:spacing w:after="200"/>
+      </w:pPr>
+      <w:r>
+        <w:rPr>
+          <w:sz w:val="22"/>
+          <w:szCs w:val="22"/>
+        </w:rPr>
+        <w:t xml:space="preserve">Une deuxième page a été ajoutée à l'application Streamlit (accessible via le menu "Dashboard"), qui reprend les métriques du modèle final, la distribution des classes, la matrice de confusion et la courbe ROC, pour pouvoir suivre les performances du modèle sans avoir à rouvrir les notebooks.</w:t>
+      </w:r>
+    </w:p>
+    <w:p>
+      <w:pPr>
+        <w:spacing w:after="80" w:before="200"/>
+        <w:jc w:val="center"/>
+      </w:pPr>
+      <w:r>
+        <w:drawing>
+          <wp:inline distT="0" distB="0" distL="0" distR="0">
+            <wp:extent cx="3333750" cy="2333625"/>
+            <wp:effectExtent t="0" r="0" b="0" l="0"/>
+            <wp:docPr id="1" name="figure" descr="Figure 6 : tableau de bord de suivi du modèle dans Streamlit" title="Figure 6 : tableau de bord de suivi du modèle dans Streamlit"/>
+            <wp:cNvGraphicFramePr>
+              <a:graphicFrameLocks xmlns:a="http://schemas.openxmlformats.org/drawingml/2006/main" noChangeAspect="1"/>
+            </wp:cNvGraphicFramePr>
+            <a:graphic xmlns:a="http://schemas.openxmlformats.org/drawingml/2006/main">
+              <a:graphicData uri="http://schemas.openxmlformats.org/drawingml/2006/picture">
+                <pic:pic xmlns:pic="http://schemas.openxmlformats.org/drawingml/2006/picture">
+                  <pic:nvPicPr>
+                    <pic:cNvPr id="0" name="" descr=""/>
+                    <pic:cNvPicPr>
+                      <a:picLocks noChangeAspect="1" noChangeArrowheads="1"/>
+                    </pic:cNvPicPr>
+                  </pic:nvPicPr>
+                  <pic:blipFill>
+                    <a:blip r:embed="rId12" cstate="none"/>
+                    <a:srcRect/>
+                    <a:stretch>
+                      <a:fillRect/>
+                    </a:stretch>
+                  </pic:blipFill>
+                  <pic:spPr bwMode="auto">
+                    <a:xfrm>
+                      <a:off x="0" y="0"/>
+                      <a:ext cx="3333750" cy="2333625"/>
+                    </a:xfrm>
+                    <a:prstGeom prst="rect">
+                      <a:avLst/>
+                    </a:prstGeom>
+                  </pic:spPr>
+                </pic:pic>
+              </a:graphicData>
+            </a:graphic>
+          </wp:inline>
+        </w:drawing>
+      </w:r>
+    </w:p>
+    <w:p>
+      <w:pPr>
+        <w:spacing w:after="200"/>
+        <w:jc w:val="center"/>
+      </w:pPr>
+      <w:r>
+        <w:rPr>
+          <w:i/>
+          <w:iCs/>
+          <w:sz w:val="18"/>
+          <w:szCs w:val="18"/>
+        </w:rPr>
+        <w:t xml:space="preserve">Figure 6 : tableau de bord de suivi du modèle dans Streamlit</w:t>
       </w:r>
     </w:p>
     <w:sectPr>

</xml_diff>

<commit_message>
Ajout du lien du depot dans le rapport et nettoyage du gitignore
</commit_message>
<xml_diff>
--- a/reports/rapport.docx
+++ b/reports/rapport.docx
@@ -40,6 +40,19 @@
     </w:p>
     <w:p>
       <w:pPr>
+        <w:spacing w:after="100"/>
+        <w:jc w:val="center"/>
+      </w:pPr>
+      <w:r>
+        <w:rPr>
+          <w:sz w:val="20"/>
+          <w:szCs w:val="20"/>
+        </w:rPr>
+        <w:t xml:space="preserve">IDENTIFIANT : N00428220141</w:t>
+      </w:r>
+    </w:p>
+    <w:p>
+      <w:pPr>
         <w:spacing w:after="400"/>
         <w:jc w:val="center"/>
       </w:pPr>
@@ -48,7 +61,7 @@
           <w:sz w:val="20"/>
           <w:szCs w:val="20"/>
         </w:rPr>
-        <w:t xml:space="preserve">IDENTIFIANT : N00428220141</w:t>
+        <w:t xml:space="preserve">Dépôt GitHub : https://github.com/jokaf/tweet-suspect-detection</w:t>
       </w:r>
     </w:p>
     <w:p>

</xml_diff>